<commit_message>
ci: install qdrant-client for offline import; refresh CV to delivered status
</commit_message>
<xml_diff>
--- a/Marcelo_Semino_CV.docx
+++ b/Marcelo_Semino_CV.docx
@@ -340,27 +340,70 @@
           <w:b/>
           <w:bCs/>
         </w:rPr>
-        <w:t xml:space="preserve">Validated on a simulated HCP knowledge base </w:t>
-      </w:r>
-      <w:r>
-        <w:t xml:space="preserve">with reproducible demo cases: grounded facts with fair balance, cross-document retrieval, off-label scoped refusal, honest “not in sources” behavior.</w:t>
-      </w:r>
-    </w:p>
-    <w:p>
-      <w:pPr>
-        <w:pStyle w:val="ListParagraph"/>
-        <w:numPr>
-          <w:ilvl w:val="0"/>
-          <w:numId w:val="2"/>
-        </w:numPr>
-        <w:spacing w:after="60"/>
-      </w:pPr>
-      <w:r>
-        <w:rPr>
-          <w:i/>
-          <w:iCs/>
-        </w:rPr>
-        <w:t xml:space="preserve">In progress: GraphRAG reranking (Neo4j), domain LoRA adapter (unsloth), versioned FastAPI endpoints with GitHub Actions CI/CD.</w:t>
+        <w:t xml:space="preserve">Hybrid GraphRAG: </w:t>
+      </w:r>
+      <w:r>
+        <w:t xml:space="preserve">a typed knowledge graph (products, classes, indications, reversal agents) queried alongside vector search — structured triples plus reranked passages — for exact relations dense retrieval alone can miss.</w:t>
+      </w:r>
+    </w:p>
+    <w:p>
+      <w:pPr>
+        <w:pStyle w:val="ListParagraph"/>
+        <w:numPr>
+          <w:ilvl w:val="0"/>
+          <w:numId w:val="2"/>
+        </w:numPr>
+        <w:spacing w:after="60"/>
+      </w:pPr>
+      <w:r>
+        <w:rPr>
+          <w:b/>
+          <w:bCs/>
+        </w:rPr>
+        <w:t xml:space="preserve">MLOps: </w:t>
+      </w:r>
+      <w:r>
+        <w:t xml:space="preserve">versioned FastAPI endpoints exposing model + prompt version per response; offline unit tests; GitHub Actions CI (green).</w:t>
+      </w:r>
+    </w:p>
+    <w:p>
+      <w:pPr>
+        <w:pStyle w:val="ListParagraph"/>
+        <w:numPr>
+          <w:ilvl w:val="0"/>
+          <w:numId w:val="2"/>
+        </w:numPr>
+        <w:spacing w:after="60"/>
+      </w:pPr>
+      <w:r>
+        <w:rPr>
+          <w:b/>
+          <w:bCs/>
+        </w:rPr>
+        <w:t xml:space="preserve">Validated </w:t>
+      </w:r>
+      <w:r>
+        <w:t xml:space="preserve">on a simulated HCP knowledge base with reproducible demo cases and a compliance eval harness (grounding, fair balance, off-label refusal, honesty).</w:t>
+      </w:r>
+    </w:p>
+    <w:p>
+      <w:pPr>
+        <w:pStyle w:val="ListParagraph"/>
+        <w:numPr>
+          <w:ilvl w:val="0"/>
+          <w:numId w:val="2"/>
+        </w:numPr>
+        <w:spacing w:after="60"/>
+      </w:pPr>
+      <w:r>
+        <w:rPr>
+          <w:b/>
+          <w:bCs/>
+        </w:rPr>
+        <w:t xml:space="preserve">Fine-tuning pipeline ready: </w:t>
+      </w:r>
+      <w:r>
+        <w:t xml:space="preserve">instruction dataset built from the corpus + a LoRA/QLoRA training script (unsloth) sized for the RTX 3090.</w:t>
       </w:r>
     </w:p>
     <w:p>

</xml_diff>